<commit_message>
Fix experience dates and responsive copy
</commit_message>
<xml_diff>
--- a/public/resume.docx
+++ b/public/resume.docx
@@ -68,7 +68,7 @@
         <w:spacing w:after="100" w:line="269" w:lineRule="auto"/>
       </w:pPr>
       <w:r>
-        <w:t>Data engineer by training and AI product builder by practice. I turn internal operational problems into dependable systems, combining multi-agent workflows, full-stack delivery, and intentional database design. Two internal AI applications are deployed and used in production, with additional products progressing through UAT. My focus is the layer that often separates a convincing AI demo from a production-ready product: reliable state, governed data, traceable decisions, clear permissions, and maintainable integration boundaries.</w:t>
+        <w:t>I am a data engineer who also builds AI products end to end. I turn internal operational problems into dependable systems by combining multi-agent workflows, full-stack delivery, and intentional database design. Two internal AI applications are in production today, with more progressing through UAT. I focus on the foundations that turn a convincing demo into a product people can rely on: durable state, governed data, traceable decisions, clear permissions, and maintainable integrations.</w:t>
       </w:r>
     </w:p>
     <w:tbl>
@@ -218,7 +218,7 @@
                 <w:color w:val="18181B"/>
                 <w:sz w:val="26"/>
               </w:rPr>
-              <w:t>2–5%</w:t>
+              <w:t>2-5%</w:t>
             </w:r>
             <w:r>
               <w:br/>
@@ -319,7 +319,7 @@
                 <w:color w:val="52525B"/>
                 <w:sz w:val="17"/>
               </w:rPr>
-              <w:t>2024 — Present</w:t>
+              <w:t>2024 to Present</w:t>
             </w:r>
           </w:p>
         </w:tc>
@@ -506,7 +506,7 @@
                 <w:color w:val="52525B"/>
                 <w:sz w:val="17"/>
               </w:rPr>
-              <w:t>Jun 2022 — 2024</w:t>
+              <w:t>Jun 2022 to 2025</w:t>
             </w:r>
           </w:p>
         </w:tc>
@@ -547,7 +547,7 @@
           <w:color w:val="52525B"/>
           <w:sz w:val="17"/>
         </w:rPr>
-        <w:t>Improved the tactical-planning optimizer to deliver an additional 2–5% cost saving for assembly products while satisfying order and operational constraints.</w:t>
+        <w:t>Improved the tactical-planning optimizer to deliver an additional 2-5% cost saving for assembly products while satisfying order and operational constraints.</w:t>
       </w:r>
     </w:p>
     <w:p>
@@ -692,7 +692,7 @@
                 <w:color w:val="52525B"/>
                 <w:sz w:val="17"/>
               </w:rPr>
-              <w:t>May — Aug 2021</w:t>
+              <w:t>May to Aug 2021</w:t>
             </w:r>
           </w:p>
         </w:tc>
@@ -979,7 +979,7 @@
                 <w:color w:val="52525B"/>
                 <w:sz w:val="17"/>
               </w:rPr>
-              <w:t>2018 — 2022</w:t>
+              <w:t>2018 to 2022</w:t>
             </w:r>
           </w:p>
         </w:tc>
@@ -1064,7 +1064,7 @@
                 <w:color w:val="52525B"/>
                 <w:sz w:val="16"/>
               </w:rPr>
-              <w:t>Nov 2025 — Nov 2027</w:t>
+              <w:t>Nov 2025 to Nov 2027</w:t>
             </w:r>
           </w:p>
         </w:tc>
@@ -1086,7 +1086,7 @@
                 <w:b/>
                 <w:sz w:val="16"/>
               </w:rPr>
-              <w:t>DART — AI for Cybersecurity Practitioners</w:t>
+              <w:t>DART: AI for Cybersecurity Practitioners</w:t>
             </w:r>
           </w:p>
         </w:tc>
@@ -1131,7 +1131,7 @@
                 <w:b/>
                 <w:sz w:val="16"/>
               </w:rPr>
-              <w:t>AI Singapore — AI for Industry®: Literacy in AI  ·  ID 32518583</w:t>
+              <w:t>AI Singapore: AI for Industry® Literacy in AI  ·  ID 32518583</w:t>
             </w:r>
           </w:p>
         </w:tc>

</xml_diff>